<commit_message>
finalize citation tuning and journal-style table typography
</commit_message>
<xml_diff>
--- a/docs/manuscript/Manuscript_Final_Revised.docx
+++ b/docs/manuscript/Manuscript_Final_Revised.docx
@@ -16,7 +16,126 @@
         <w:t>From genetic liability to epigenetic risk: a multi-omics framework for prognostic stratification in lung squamous cell carcinoma</w:t>
       </w:r>
     </w:p>
-    <w:p/>
+    <w:p>
+      <w:pPr>
+        <w:spacing w:after="60"/>
+        <w:jc w:val="center"/>
+      </w:pPr>
+      <w:r>
+        <w:rPr>
+          <w:rFonts w:ascii="Times New Roman" w:hAnsi="Times New Roman"/>
+          <w:b w:val="0"/>
+          <w:i w:val="0"/>
+          <w:sz w:val="22"/>
+        </w:rPr>
+        <w:t>Xiongjie Li¹†, Fengyue Zhang²†, Zhenyao Wu³, Xuan Xu³, Xiaoyan Zhang⁴, Xianghui Wang¹*</w:t>
+      </w:r>
+    </w:p>
+    <w:p>
+      <w:pPr>
+        <w:spacing w:after="20"/>
+        <w:jc w:val="center"/>
+      </w:pPr>
+      <w:r>
+        <w:rPr>
+          <w:rFonts w:ascii="Times New Roman" w:hAnsi="Times New Roman"/>
+          <w:b w:val="0"/>
+          <w:i w:val="0"/>
+          <w:sz w:val="21"/>
+        </w:rPr>
+        <w:t>¹ Department of Cardiothoracic and Vascular Surgery, Jingzhou Hospital Affiliated to Yangtze University, No. 26 Chuyuan Avenue, Jingzhou District, Jingzhou 434020, Hubei, China</w:t>
+      </w:r>
+    </w:p>
+    <w:p>
+      <w:pPr>
+        <w:spacing w:after="20"/>
+        <w:jc w:val="center"/>
+      </w:pPr>
+      <w:r>
+        <w:rPr>
+          <w:rFonts w:ascii="Times New Roman" w:hAnsi="Times New Roman"/>
+          <w:b w:val="0"/>
+          <w:i w:val="0"/>
+          <w:sz w:val="21"/>
+        </w:rPr>
+        <w:t>² Department of Gastroenterology, Qianjiang Jianghan Oilfield General Hospital, Qianjiang 433100, Hubei, China</w:t>
+      </w:r>
+    </w:p>
+    <w:p>
+      <w:pPr>
+        <w:spacing w:after="20"/>
+        <w:jc w:val="center"/>
+      </w:pPr>
+      <w:r>
+        <w:rPr>
+          <w:rFonts w:ascii="Times New Roman" w:hAnsi="Times New Roman"/>
+          <w:b w:val="0"/>
+          <w:i w:val="0"/>
+          <w:sz w:val="21"/>
+        </w:rPr>
+        <w:t>³ Department of Cardiothoracic, Thyroid and Breast Surgery, Qianjiang Jianghan Oilfield General Hospital, Qianjiang 433100, Hubei, China</w:t>
+      </w:r>
+    </w:p>
+    <w:p>
+      <w:pPr>
+        <w:spacing w:after="40"/>
+        <w:jc w:val="center"/>
+      </w:pPr>
+      <w:r>
+        <w:rPr>
+          <w:rFonts w:ascii="Times New Roman" w:hAnsi="Times New Roman"/>
+          <w:b w:val="0"/>
+          <w:i w:val="0"/>
+          <w:sz w:val="21"/>
+        </w:rPr>
+        <w:t>⁴ Department of Clinical Laboratory, Qianjiang Jianghan Oilfield General Hospital, Qianjiang 433100, Hubei, China</w:t>
+      </w:r>
+    </w:p>
+    <w:p>
+      <w:pPr>
+        <w:spacing w:after="20"/>
+        <w:jc w:val="center"/>
+      </w:pPr>
+      <w:r>
+        <w:rPr>
+          <w:rFonts w:ascii="Times New Roman" w:hAnsi="Times New Roman"/>
+          <w:b w:val="0"/>
+          <w:i/>
+          <w:sz w:val="21"/>
+        </w:rPr>
+        <w:t>† These authors contributed equally to this work.</w:t>
+      </w:r>
+    </w:p>
+    <w:p>
+      <w:pPr>
+        <w:spacing w:after="20"/>
+        <w:jc w:val="center"/>
+      </w:pPr>
+      <w:r>
+        <w:rPr>
+          <w:rFonts w:ascii="Times New Roman" w:hAnsi="Times New Roman"/>
+          <w:b w:val="0"/>
+          <w:i w:val="0"/>
+          <w:sz w:val="21"/>
+        </w:rPr>
+        <w:t>*Corresponding author: Xianghui Wang (wangxianghui8104@163.com)</w:t>
+      </w:r>
+    </w:p>
+    <w:p>
+      <w:pPr>
+        <w:spacing w:after="120"/>
+        <w:jc w:val="center"/>
+      </w:pPr>
+      <w:r>
+        <w:rPr>
+          <w:rFonts w:ascii="Times New Roman" w:hAnsi="Times New Roman"/>
+          <w:b w:val="0"/>
+          <w:i w:val="0"/>
+          <w:sz w:val="21"/>
+        </w:rPr>
+        <w:t>Xiongjie Li (ORCID: 0009-0005-9507-6829; Email: surobert518@163.com)</w:t>
+      </w:r>
+    </w:p>
     <w:p>
       <w:pPr>
         <w:spacing w:before="200" w:after="80"/>
@@ -161,7 +280,7 @@
           <w:rFonts w:ascii="Times New Roman" w:hAnsi="Times New Roman"/>
           <w:sz w:val="24"/>
         </w:rPr>
-        <w:t>Lung cancer remains a leading cause of cancer-related mortality worldwide [24], and recurrence after curative-intent resection is a major determinant of outcome in non-small cell lung cancer, including LUSC [1,4]. Current clinicopathological risk stratification, including TNM staging, does not fully capture inter-individual variability in recurrence risk [41]. Despite advances in treatment, the identification of patients at high risk of relapse remains limited, underscoring the need for biomarkers that more directly reflect tumor biology and therapeutic vulnerability [3].</w:t>
+        <w:t>Lung cancer remains a leading cause of cancer-related mortality worldwide [33,36]. Recurrence after curative-intent resection is a major determinant of outcome in non-small cell lung cancer, including LUSC [27,28]. Current clinicopathological risk stratification, including TNM staging, does not fully capture inter-individual variability in recurrence risk [14]. Despite advances in treatment, the identification of patients at high risk of relapse remains limited in LUSC [23], particularly in the context of the heterogeneous molecular landscape of the disease [5,37].</w:t>
       </w:r>
     </w:p>
     <w:p>
@@ -175,7 +294,7 @@
           <w:rFonts w:ascii="Times New Roman" w:hAnsi="Times New Roman"/>
           <w:sz w:val="24"/>
         </w:rPr>
-        <w:t>Accumulating evidence suggests that systemic metabolic and inflammatory liabilities contribute to lung cancer development and progression [5-8,48,49]. However, such associations are often difficult to interpret because of residual confounding, reverse causation, and population heterogeneity. Mendelian randomization (MR) has emerged as a rigorous framework for strengthening causal inference by leveraging genetic variants as instrumental variables [9,25,44]. Nevertheless, etiological signals derived from MR alone are insufficient for clinical translation because they do not directly resolve tumor-level molecular mechanisms or prognostic biomarkers.</w:t>
+        <w:t>Accumulating evidence suggests that systemic metabolic and inflammatory liabilities contribute to lung cancer development and progression [15,25]. However, such associations are often difficult to interpret because of residual confounding, reverse causation, and population heterogeneity. Mendelian randomization (MR) has emerged as a rigorous framework for strengthening causal inference by leveraging genetic variants as instrumental variables [4,18]. Nevertheless, etiological signals derived from MR alone are insufficient for clinical translation because they do not directly resolve tumor-level molecular mechanisms or prognostic biomarkers.</w:t>
       </w:r>
     </w:p>
     <w:p>
@@ -189,7 +308,7 @@
           <w:rFonts w:ascii="Times New Roman" w:hAnsi="Times New Roman"/>
           <w:sz w:val="24"/>
         </w:rPr>
-        <w:t>A key missing component is a molecular “translation layer” linking upstream liabilities to stable and clinically measurable tumor features. DNA methylation is well suited to this role because of its biological relevance, relative stability, and partial genetic regulation through methylation quantitative trait loci (mQTL) [10,12-17,46,52]. Integrating MR with mQTL mapping and Bayesian colocalization therefore provides an opportunity to prioritize epigenetic signals that are both genetically anchored and functionally plausible, thereby improving the specificity of candidate biomarker discovery [16,17,29].</w:t>
+        <w:t>A key missing component is a molecular “translation layer” linking upstream liabilities to stable and clinically measurable tumor features. DNA methylation is well suited to this role because of its biological relevance, relative stability, and mechanistic coupling to cellular metabolism [9,22]. Its translational appeal is further supported by established links between epigenetic remodeling, cancer biology, and biomarker development [20,42]. Partial genetic regulation through methylation quantitative trait loci (mQTL) further enables causal anchoring [11,26]. Integrating MR with mQTL mapping and Bayesian colocalization therefore provides an opportunity to prioritize epigenetic signals that are both genetically anchored and functionally plausible [13,29], while improving the specificity of candidate biomarker discovery through shared-signal evaluation [30,43].</w:t>
       </w:r>
     </w:p>
     <w:p>
@@ -203,7 +322,7 @@
           <w:rFonts w:ascii="Times New Roman" w:hAnsi="Times New Roman"/>
           <w:sz w:val="24"/>
         </w:rPr>
-        <w:t>In this study, we propose a causal-to-translational multi-omics framework that integrates Mendelian randomization, mQTL mapping, Bayesian colocalization, and multi-layer omics validation to identify biologically grounded epigenetic signals. We further translate these genetically informed CpG sites into a parsimonious and externally validated methylation-based prognostic model (M12) for risk stratification in lung squamous cell carcinoma. By bridging causal inference with tumor-level molecular features and clinical outcomes, this approach aims to establish a mechanistically informed pathway from genetic liability to prognostic biomarkers in precision oncology.</w:t>
+        <w:t>In this study, we propose a causal-to-translational multi-omics framework that integrates Mendelian randomization, mQTL mapping, Bayesian colocalization, and multi-layer omics validation to identify biologically grounded epigenetic signals [17]. We further translate these genetically informed CpG sites into a parsimonious and externally validated methylation-based prognostic model (M12) for risk stratification in lung squamous cell carcinoma. By bridging causal inference with tumor-level molecular features and clinical outcomes, this approach aims to establish a mechanistically informed pathway from genetic liability to prognostic biomarkers in precision oncology.</w:t>
       </w:r>
     </w:p>
     <w:p>
@@ -245,7 +364,7 @@
           <w:rFonts w:ascii="Times New Roman" w:hAnsi="Times New Roman"/>
           <w:sz w:val="24"/>
         </w:rPr>
-        <w:t>We established a causal-to-translational multi-omics analytical framework to identify biologically informed epigenetic biomarkers and to assess their clinical relevance in lung squamous cell carcinoma (LUSC). The workflow integrated Mendelian randomization (MR), methylation quantitative trait locus (mQTL) mapping, Bayesian colocalization, and multi-layer omics validation, thereby enabling stepwise prioritization from upstream genetic liability to downstream prognostic application [9,11,16,17,29]. A schematic overview of the study design is provided in Figure 1.</w:t>
+        <w:t>We established a causal-to-translational multi-omics analytical framework to identify biologically informed epigenetic biomarkers and to assess their clinical relevance in lung squamous cell carcinoma (LUSC). The workflow integrated Mendelian randomization (MR) with methylation quantitative trait locus (mQTL) mapping to anchor upstream liabilities to CpG-level regulation [4,13]. Bayesian colocalization and multi-layer omics validation were then used to refine candidate signals and support downstream prognostic application [17,30]. A schematic overview of the study design is provided in Figure 1.</w:t>
       </w:r>
     </w:p>
     <w:p>
@@ -288,7 +407,7 @@
           <w:rFonts w:ascii="Times New Roman" w:hAnsi="Times New Roman"/>
           <w:sz w:val="24"/>
         </w:rPr>
-        <w:t>Two-sample MR analyses were conducted to estimate the putative causal effects of metabolic, inflammatory, and lifestyle-related exposures on lung cancer outcomes. Instrumental variables were selected at genome-wide significance (P &lt; 5 × 10⁻⁸) and pruned for linkage disequilibrium (r² &lt; 0.001) to ensure independence among retained variants, in accordance with contemporary MR practice recommendations [11]. Summary statistics were derived from large-scale public GWAS resources and consortia, including studies of body mass index, smoking and alcohol use, inflammatory traits, circulating lipids, and lung cancer susceptibility [18-23,26].</w:t>
+        <w:t>Two-sample MR analyses were conducted to estimate the putative causal effects of metabolic, inflammatory, and lifestyle-related exposures on lung cancer outcomes. Instrumental variable selection followed established MR guidance, with variants retained at genome-wide significance (P &lt; 5 × 10⁻⁸) and pruned for linkage disequilibrium (r² &lt; 0.001) to ensure independence among retained variants [4]. Summary statistics were obtained from large-scale public GWAS consortia and harmonized through established MR-oriented resources [1,18,39].</w:t>
       </w:r>
     </w:p>
     <w:p>
@@ -344,7 +463,7 @@
           <w:rFonts w:ascii="Times New Roman" w:hAnsi="Times New Roman"/>
           <w:sz w:val="24"/>
         </w:rPr>
-        <w:t>To evaluate the robustness of the IVW estimates and to assess potential horizontal pleiotropy, complementary sensitivity analyses were performed using MR-Egger regression, the weighted median estimator, and MR-PRESSO [27,43]. The MR-Egger model was specified as:</w:t>
+        <w:t>To evaluate the robustness of the IVW estimates and to assess potential horizontal pleiotropy, complementary sensitivity analyses were performed using MR-Egger regression, the weighted median estimator, and MR-PRESSO [3,41]. The MR-Egger model was specified as:</w:t>
       </w:r>
     </w:p>
     <w:p>
@@ -400,7 +519,7 @@
           <w:rFonts w:ascii="Times New Roman" w:hAnsi="Times New Roman"/>
           <w:sz w:val="24"/>
         </w:rPr>
-        <w:t>Multivariable MR (MVMR) was performed to estimate the independent effects of correlated exposures within a joint modeling framework [47]. To further explore biologically plausible intermediate pathways, two-step MR analyses were undertaken by separately modeling exposure-mediator and mediator-outcome associations, with particular emphasis on the potential mediating role of inflammatory markers in metabolic risk transmission [16,50]. Indirect effects were interpreted according to the product-of-coefficients framework. Extended MVMR and mediation analyses are shown in Tables S2–S3.</w:t>
+        <w:t>Multivariable MR (MVMR) was performed to estimate the independent effects of correlated exposures within a joint modeling framework [32]. To further explore biologically plausible intermediate pathways, two-step MR analyses were undertaken by separately modeling exposure-mediator and mediator-outcome associations, with particular emphasis on the potential mediating role of inflammatory markers in metabolic risk transmission [6,29]. Indirect effects were interpreted according to the product-of-coefficients framework. Extended MVMR and mediation analyses are shown in Tables S2–S3.</w:t>
       </w:r>
     </w:p>
     <w:p>
@@ -428,7 +547,7 @@
           <w:rFonts w:ascii="Times New Roman" w:hAnsi="Times New Roman"/>
           <w:sz w:val="24"/>
         </w:rPr>
-        <w:t>To prioritize CpG sites that potentially translate inherited liability into tumor-level molecular regulation, we implemented an epigenetic triangulation framework integrating mQTL mapping, MR directionality, and Bayesian colocalization analysis [15-17,29,45,46]. mQTL datasets were first used to identify genetically regulated CpG loci. Colocalization analysis was then applied to evaluate whether the exposure-associated and methylation-associated signals were likely attributable to a shared causal variant; posterior probability for hypothesis 4 (PP.H4) &gt; 0.30 was considered suggestive evidence of colocalization. CpG sites were retained only when the inferred directions of effect were concordant across the MR and mQTL layers. Full colocalization results are provided in Table S4, with regional plots shown in Figure S3.</w:t>
+        <w:t>To prioritize CpG sites that potentially translate inherited liability into tumor-level molecular regulation, we implemented an epigenetic triangulation framework integrating mQTL mapping, MR directionality, and Bayesian colocalization analysis. mQTL resources were first used to identify genetically regulated CpG loci [11,26]. These candidates were then filtered according to concordant MR directionality within a triangulation framework [13,29]. Colocalization analysis was subsequently applied to evaluate whether the exposure-associated and methylation-associated signals were likely attributable to a shared causal variant [30,43]; posterior probability for hypothesis 4 (PP.H4) &gt; 0.30 was considered suggestive evidence of colocalization. CpG sites were retained only when the inferred directions of effect were concordant across the MR and mQTL layers. Full colocalization results are provided in Table S4, with regional plots shown in Figure S3.</w:t>
       </w:r>
     </w:p>
     <w:p>
@@ -456,7 +575,7 @@
           <w:rFonts w:ascii="Times New Roman" w:hAnsi="Times New Roman"/>
           <w:sz w:val="24"/>
         </w:rPr>
-        <w:t>Prioritized CpG sites and their annotated genes were subsequently evaluated across transcriptomic, proteomic, and immune-related datasets to strengthen biological interpretation and translational relevance. Transcriptomic processing and differential analyses were aligned with established RNA-seq and microarray workflows [28,30,31,34], with missing data handled according to standard imputation principles where required [33]. Functional enrichment analyses were performed to identify pathways associated with the candidate genes, with particular emphasis on coagulation, platelet activation, extracellular matrix organization, and immune-related processes implicated in tumor microenvironment remodeling, using established pathway resources and analytic frameworks [35-38,42]. CpG-to-gene mapping details are summarized in Table S5.</w:t>
+        <w:t>Prioritized CpG sites and their annotated genes were subsequently evaluated across transcriptomic, proteomic, and immune-related datasets to strengthen biological interpretation and translational relevance [17]. Transcriptomic processing and differential analyses were aligned with established RNA-seq and microarray workflows [24,31], with batch correction performed using empirical Bayes adjustment where required [19]. Functional enrichment analyses were performed using established pathway resources, including Reactome and GSVA [10,16], with tissue-level contextualization from GTEx [38] and particular emphasis on tumor immune microenvironment remodeling [2]. Enrichment visualization and annotation were implemented with clusterProfiler [45]. CpG-to-gene mapping details are summarized in Table S5.</w:t>
       </w:r>
     </w:p>
     <w:p>
@@ -484,7 +603,7 @@
           <w:rFonts w:ascii="Times New Roman" w:hAnsi="Times New Roman"/>
           <w:sz w:val="24"/>
         </w:rPr>
-        <w:t>DNA methylation profiles and corresponding clinical follow-up data were obtained from the TCGA-LUSC cohort for prognostic model development [2]. Feature selection was performed using a penalized Cox proportional hazards model with LASSO regularization and 10-fold cross-validation, following established machine-learning and regularization principles for biomedical prediction modeling [32,39]. Candidate signatures were subsequently compared using a composite selection score, and the final 12-CpG signature (M12_Top12) was selected on the basis of overall parsimony-performance balance. The Cox proportional hazards model was defined as:</w:t>
+        <w:t>DNA methylation profiles and corresponding clinical follow-up data were obtained from the TCGA-LUSC cohort for prognostic model development [37]. Feature selection was performed using a penalized Cox proportional hazards model with LASSO regularization and 10-fold cross-validation [34,44]. Model development and reporting were aligned with contemporary principles for biomedical prediction modeling [7,35]. Candidate signatures were subsequently compared using a composite selection score, and the final 12-CpG signature (M12_Top12) was selected on the basis of overall parsimony-performance balance. The Cox proportional hazards model was defined as:</w:t>
       </w:r>
     </w:p>
     <w:p>
@@ -596,7 +715,7 @@
           <w:rFonts w:ascii="Times New Roman" w:hAnsi="Times New Roman"/>
           <w:sz w:val="24"/>
         </w:rPr>
-        <w:t>Model performance was comprehensively evaluated using Kaplan-Meier survival analysis, nonparametric time-to-event estimation under censoring, the concordance index (C-index), time-dependent receiver operating characteristic (ROC) analysis, calibration curves, and decision curve analysis (DCA) [40]. In the TCGA-LUSC training cohort, patients were dichotomized into high- and low-risk groups according to the median training-cohort risk score. The TCGA cohort was randomly split into training and internal validation sets using stratified sampling based on survival status. External validation was performed in two independent microarray cohorts (GSE39279 and GSE30219), in which optimal cutoffs were determined using the maxstat (maximally selected rank statistics) procedure. Given the heterogeneity in endpoint definition across validation cohorts, namely recurrence-free survival in GSE39279 and overall survival in GSE30219, external validation primarily focused on discriminative performance, whereas calibration and DCA were principally assessed in the TCGA training cohort. Additional diagnostic analyses are shown in Figure S5 and Tables S8–S9.</w:t>
+        <w:t>Model performance was comprehensively evaluated using Kaplan-Meier survival analysis, nonparametric time-to-event estimation under censoring, the concordance index (C-index), time-dependent receiver operating characteristic (ROC) analysis, calibration curves, and decision curve analysis (DCA) [40]. In the TCGA-LUSC training cohort, patients were dichotomized into high- and low-risk groups according to the median training-cohort risk score. The TCGA cohort was randomly split into training and internal validation sets using stratified sampling based on survival status. External validation was performed in two independent microarray cohorts (GSE39279 and GSE30219), in which optimal cutoffs were determined using the maxstat (maximally selected rank statistics) procedure. Given the heterogeneity in endpoint definition across validation cohorts, namely recurrence-free survival in GSE39279 and overall survival in GSE30219, external validation primarily focused on discriminative performance, whereas calibration and DCA were principally assessed in the TCGA training cohort. Model development and reporting were aligned with contemporary prediction-model guidance [7,35,44]. Additional diagnostic analyses are shown in Figure S5 and Tables S8–S9.</w:t>
       </w:r>
     </w:p>
     <w:p>
@@ -751,7 +870,7 @@
           <w:rFonts w:ascii="Times New Roman" w:hAnsi="Times New Roman"/>
           <w:sz w:val="24"/>
         </w:rPr>
-        <w:t>Although these associations did not survive multiple testing correction, the recurrent involvement of CRP across multiple pathways suggests a biologically plausible inflammatory axis underlying LUSC risk (Figure 2C; Tables S2–S3).</w:t>
+        <w:t>Although these associations did not survive multiple testing correction, the recurrent involvement of CRP across multiple pathways suggests a biologically plausible inflammatory axis underlying LUSC risk, consistent with prior evidence linking systemic inflammation to lung carcinogenesis [15] (Figure 2C; Tables S2–S3).</w:t>
       </w:r>
     </w:p>
     <w:p>
@@ -864,7 +983,7 @@
           <w:rFonts w:ascii="Times New Roman" w:hAnsi="Times New Roman"/>
           <w:sz w:val="24"/>
         </w:rPr>
-        <w:t>Notably, transcriptomic and proteomic analyses showed partial discordance at the gene expression level but consistent activation at the pathway level, suggesting post-transcriptional regulation. Functional enrichment further supported a platelet–ECM axis and microtubule-related transport processes.</w:t>
+        <w:t>Notably, transcriptomic and proteomic analyses showed partial discordance at the gene expression level but consistent activation at the pathway level, suggesting post-transcriptional regulation. Functional enrichment further supported a platelet–ECM axis and microtubule-related transport processes, in line with prior evidence implicating platelet activation, extracellular matrix remodeling, and metastatic support functions in tumor progression [12,21].</w:t>
       </w:r>
     </w:p>
     <w:p>
@@ -921,7 +1040,7 @@
           <w:rFonts w:ascii="Times New Roman" w:hAnsi="Times New Roman"/>
           <w:sz w:val="24"/>
         </w:rPr>
-        <w:t>We translated the prioritized epigenetic signals into a methylation-based prognostic model using penalized LASSO-Cox regression. The final model comprised 12 CpG sites (M12) and demonstrated stable prognostic performance in the TCGA-LUSC training cohort (Figure 5A–C; Table 4; Tables S6–S7).</w:t>
+        <w:t>We translated the prioritized epigenetic signals into a methylation-based prognostic model using penalized LASSO-Cox regression. The final model comprised 12 CpG sites (M12) and demonstrated stable prognostic performance in the TCGA-LUSC training cohort, consistent with contemporary principles for parsimonious prognostic modeling [35] (Figure 5A–C; Table 4; Tables S6–S7).</w:t>
       </w:r>
     </w:p>
     <w:p>
@@ -1064,7 +1183,7 @@
           <w:rFonts w:ascii="Times New Roman" w:hAnsi="Times New Roman"/>
           <w:sz w:val="24"/>
         </w:rPr>
-        <w:t>In this study, we developed a causal-to-translational multi-omics framework that links genetic liability to clinically relevant epigenetic markers in lung squamous cell carcinoma (LUSC). By integrating Mendelian randomization, mQTL mapping, and colocalization analyses, our approach prioritizes CpG sites that are both genetically anchored and functionally supported, thereby moving beyond conventional association-based biomarker discovery. These signals were subsequently translated into a 12-CpG methylation signature (M12), which demonstrated consistent prognostic stratification in both training and independent validation cohorts, with acceptable discrimination and good calibration. Together, these findings support a unified framework in which upstream metabolic–inflammatory liabilities are connected to tumor microenvironment remodeling and ultimately to clinically actionable risk prediction.</w:t>
+        <w:t>In this study, we developed a causal-to-translational multi-omics framework that links genetic liability to clinically relevant epigenetic markers in lung squamous cell carcinoma (LUSC). By integrating Mendelian randomization with epigenetic triangulation and multi-omics interpretation, our approach moves beyond conventional association-based biomarker discovery and aligns with broader efforts to connect causal inference with molecular profiling in complex disease biology [17]. These signals were subsequently translated into a 12-CpG methylation signature (M12), which demonstrated consistent prognostic stratification in both training and independent validation cohorts, with acceptable discrimination and good calibration. Together, these findings support a unified framework in which upstream metabolic–inflammatory liabilities are connected to tumor microenvironment remodeling and ultimately to clinically actionable risk prediction.</w:t>
       </w:r>
     </w:p>
     <w:p>
@@ -1078,7 +1197,7 @@
           <w:rFonts w:ascii="Times New Roman" w:hAnsi="Times New Roman"/>
           <w:sz w:val="24"/>
         </w:rPr>
-        <w:t>A key insight from this work is that metabolic–inflammatory risk in LUSC is best conceptualized as a networked liability rather than a single-factor effect [5-8,48,49]. The recurrent involvement of CRP across multiple pathways suggests a central inflammatory axis linking systemic metabolic perturbations to tumor risk, consistent with prior evidence implicating inflammatory mediators in lung carcinogenesis [7,8]. Although these findings should be interpreted as hypothesis-generating rather than definitive mediation, they provide a coherent biological framework for understanding subtype-specific susceptibility.</w:t>
+        <w:t>A key insight from this work is that metabolic–inflammatory risk in LUSC is best conceptualized as a networked liability rather than a single-factor effect [15,25]. The recurrent involvement of CRP across multiple pathways supports an inflammatory axis linking systemic metabolic perturbations to tumor risk. Although these findings should be interpreted as hypothesis-generating rather than definitive mediation, they provide a coherent biological framework for understanding subtype-specific susceptibility.</w:t>
       </w:r>
     </w:p>
     <w:p>
@@ -1092,7 +1211,7 @@
           <w:rFonts w:ascii="Times New Roman" w:hAnsi="Times New Roman"/>
           <w:sz w:val="24"/>
         </w:rPr>
-        <w:t>The epigenetic triangulation strategy represents an important refinement step by integrating genetic and molecular evidence at the CpG level. The probe-specific signal observed at the MFAP2 locus highlights the importance of fine-grained epigenetic resolution, as adjacent CpG sites within the same locus may exhibit distinct functional roles. This finding underscores the value of combining mQTL, MR, and colocalization to improve the specificity of biomarker discovery.</w:t>
+        <w:t>The epigenetic triangulation strategy represents an important refinement step by integrating genetic and molecular evidence at the CpG level. The probe-specific signal observed at the MFAP2 locus highlights the importance of fine-grained epigenetic resolution, as adjacent CpG sites within the same locus may exhibit distinct functional roles. This finding underscores the value of combining mQTL, MR, and colocalization to improve the specificity of biomarker discovery [11,30].</w:t>
       </w:r>
     </w:p>
     <w:p>
@@ -1106,7 +1225,7 @@
           <w:rFonts w:ascii="Times New Roman" w:hAnsi="Times New Roman"/>
           <w:sz w:val="24"/>
         </w:rPr>
-        <w:t>Multi-omics integration further demonstrated that these genetically anchored signals converge on a coherent tumor program characterized by coagulation, platelet activation, and extracellular matrix remodeling. This program provides a plausible mechanistic bridge linking systemic liabilities to tumor microenvironment dynamics and is biologically compatible with prior evidence implicating platelet-mediated interactions in metastatic progression [51].</w:t>
+        <w:t>Multi-omics integration further demonstrated that these genetically anchored signals converge on a coherent tumor program characterized by coagulation, platelet activation, extracellular matrix remodeling, and immune-contexture shifts within the tumor microenvironment [2]. This program provides a plausible mechanistic bridge linking systemic liabilities to tumor microenvironment dynamics, consistent with foundational links between inflammatory microenvironments and tumor promotion [8]. It is also biologically compatible with prior evidence implicating platelet-mediated interactions in metastatic progression [12,21].</w:t>
       </w:r>
     </w:p>
     <w:p>
@@ -1120,7 +1239,7 @@
           <w:rFonts w:ascii="Times New Roman" w:hAnsi="Times New Roman"/>
           <w:sz w:val="24"/>
         </w:rPr>
-        <w:t>From a clinical perspective, the M12 methylation signature illustrates that biologically informed multi-feature models can capture meaningful prognostic information. Although its discriminative performance was moderate, calibration was good in the training cohort and significant survival stratification was preserved across independent datasets. The stronger performance of continuous risk assessment further suggests that the signature may be most informative when interpreted as a quantitative prognostic measure, consistent with broader efforts to translate DNA methylation biomarkers into clinically usable tools [13,14,52].</w:t>
+        <w:t>From a clinical perspective, the M12 methylation signature illustrates that biologically informed multi-feature models can capture meaningful prognostic information. Although its discriminative performance was moderate, calibration was good in the training cohort and significant survival stratification was preserved across independent datasets. The stronger performance of continuous risk assessment further suggests that the signature may be most informative when interpreted as a quantitative prognostic measure, consistent with established recommendations for clinically usable prediction models and epigenetic biomarker translation [35,42].</w:t>
       </w:r>
     </w:p>
     <w:p>
@@ -1134,7 +1253,7 @@
           <w:rFonts w:ascii="Times New Roman" w:hAnsi="Times New Roman"/>
           <w:sz w:val="24"/>
         </w:rPr>
-        <w:t>Importantly, beyond the specific findings, this study provides a generalizable framework for biomarker discovery that integrates causal inference with multi-omics validation. This design enables a systematic transition from genetic association to functional prioritization and clinical translation, which may be applicable to other complex diseases.</w:t>
+        <w:t>Importantly, beyond the specific findings, this study provides a generalizable framework for biomarker discovery that integrates causal inference with multi-omics validation. This design enables a systematic transition from genetic association to functional prioritization and clinical translation, in line with broader efforts to integrate molecular profiling across complex diseases [17], and may be applicable to other complex diseases.</w:t>
       </w:r>
     </w:p>
     <w:p>
@@ -1148,7 +1267,7 @@
           <w:rFonts w:ascii="Times New Roman" w:hAnsi="Times New Roman"/>
           <w:sz w:val="24"/>
         </w:rPr>
-        <w:t>Several limitations should be acknowledged. First, MR is designed for etiological inference rather than prognostic modeling, and the transition from genetic liability to recurrence outcomes should be interpreted with caution [50]. Second, colocalization analyses may be affected by locus complexity and the presence of multiple causal variants [45]. Third, external validation was conducted in relatively modest cohorts, which may limit generalizability. Future studies should focus on prospective validation and experimental characterization of prioritized CpG sites.</w:t>
+        <w:t>Several limitations should be acknowledged. First, MR is designed for etiological inference rather than prognostic modeling, and the transition from genetic liability to recurrence outcomes should be interpreted with caution [6]. Second, colocalization analyses may be affected by locus complexity and the presence of multiple causal variants [43]. Third, external validation was conducted in relatively modest cohorts, which may limit generalizability. Future studies should focus on prospective validation and experimental characterization of prioritized CpG sites.</w:t>
       </w:r>
     </w:p>
     <w:p>
@@ -1335,6 +1454,20 @@
     </w:p>
     <w:p>
       <w:pPr>
+        <w:spacing w:line="276" w:lineRule="auto" w:after="80"/>
+        <w:ind w:firstLine="360"/>
+        <w:jc w:val="both"/>
+      </w:pPr>
+      <w:r>
+        <w:rPr>
+          <w:rFonts w:ascii="Times New Roman" w:hAnsi="Times New Roman"/>
+          <w:sz w:val="24"/>
+        </w:rPr>
+        <w:t>Xiongjie Li and Fengyue Zhang contributed equally to this work.</w:t>
+      </w:r>
+    </w:p>
+    <w:p>
+      <w:pPr>
         <w:spacing w:before="200" w:after="80"/>
         <w:jc w:val="left"/>
       </w:pPr>
@@ -1484,7 +1617,7 @@
           <w:rFonts w:ascii="Times New Roman" w:hAnsi="Times New Roman"/>
           <w:sz w:val="20"/>
         </w:rPr>
-        <w:t>1. Potter, A. L. et al. Recurrence After Complete Resection for Non-Small Cell Lung Cancer in the National Lung Screening Trial. Ann Thorac Surg 116, 684–692, doi:10.1016/j.athoracsur.2023.06.004 (2023).</w:t>
+        <w:t>1. 23andMe Research Team, HUNT All-In Psychiatry, Liu M, et al. Association studies of up to 1.2 million individuals yield new insights into the genetic etiology of tobacco and alcohol use. Nat Genet. 2019;51(2):237-244. doi:10.1038/s41588-018-0307-5</w:t>
       </w:r>
     </w:p>
     <w:p>
@@ -1498,7 +1631,7 @@
           <w:rFonts w:ascii="Times New Roman" w:hAnsi="Times New Roman"/>
           <w:sz w:val="20"/>
         </w:rPr>
-        <w:t>2. Cancer Genome Atlas Research, N. Comprehensive genomic characterization of squamous cell lung cancers. Nature 489, 519–525, doi:10.1038/nature11404 (2012).</w:t>
+        <w:t>2. Binnewies M, Roberts EW, Kersten K, et al. Understanding the tumor immune microenvironment (TIME) for effective therapy. Nat Med. 2018;24(5):541-550. doi:10.1038/s41591-018-0014-x</w:t>
       </w:r>
     </w:p>
     <w:p>
@@ -1512,7 +1645,7 @@
           <w:rFonts w:ascii="Times New Roman" w:hAnsi="Times New Roman"/>
           <w:sz w:val="20"/>
         </w:rPr>
-        <w:t>3. Lau, S. C. M., Pan, Y., Velcheti, V. &amp; Wong, K. K. Squamous cell lung cancer: Current landscape and future therapeutic options. Cancer Cell 40, 1279–1293, doi:10.1016/j.ccell.2022.09.018 (2022).</w:t>
+        <w:t>3. Bowden J, Davey Smith G, Burgess S. Mendelian randomization with invalid instruments: Effect estimation and bias detection through egger regression. International Journal of Epidemiology. 2015;44(2):512-525. doi:10.1093/ije/dyv080</w:t>
       </w:r>
     </w:p>
     <w:p>
@@ -1526,7 +1659,7 @@
           <w:rFonts w:ascii="Times New Roman" w:hAnsi="Times New Roman"/>
           <w:sz w:val="20"/>
         </w:rPr>
-        <w:t>4. Rajaram, R. et al. Recurrence-Free Survival in Patients With Surgically Resected Non-Small Cell Lung Cancer: A Systematic Literature Review and Meta-Analysis. Chest 165, 1260–1270, doi:10.1016/j.chest.2023.11.042 (2024).</w:t>
+        <w:t>4. Burgess S, Davey Smith G, Davies NM, et al. Guidelines for performing mendelian randomization investigations: Update for summer 2023. Wellcome Open Res. 2023;4:186. doi:10.12688/wellcomeopenres.15555.3</w:t>
       </w:r>
     </w:p>
     <w:p>
@@ -1540,7 +1673,7 @@
           <w:rFonts w:ascii="Times New Roman" w:hAnsi="Times New Roman"/>
           <w:sz w:val="20"/>
         </w:rPr>
-        <w:t>5. Carreras-Torres, R. et al. Obesity, metabolic factors and risk of different histological types of lung cancer: A Mendelian randomization study. PLoS One 12, e0177875, doi:10.1371/journal.pone.0177875 (2017).</w:t>
+        <w:t>5. Campbell JD, Alexandrov A, Kim J, et al. Distinct patterns of somatic genome alterations in lung adenocarcinomas and squamous cell carcinomas. Nat Genet. 2016;48(6):607-616. doi:10.1038/ng.3564</w:t>
       </w:r>
     </w:p>
     <w:p>
@@ -1554,7 +1687,7 @@
           <w:rFonts w:ascii="Times New Roman" w:hAnsi="Times New Roman"/>
           <w:sz w:val="20"/>
         </w:rPr>
-        <w:t>6. Wei, Z. et al. The association between metabolic syndrome and lung cancer risk: a Mendelian randomization study. Sci Rep 14, 28494, doi:10.1038/s41598-024-79260-y (2024).</w:t>
+        <w:t>6. Carter AR, Sanderson E, Hammerton G, et al. Mendelian randomisation for mediation analysis: Current methods and challenges for implementation. Eur J Epidemiol. 2021;36(5):465-478. doi:10.1007/s10654-021-00757-1</w:t>
       </w:r>
     </w:p>
     <w:p>
@@ -1568,7 +1701,7 @@
           <w:rFonts w:ascii="Times New Roman" w:hAnsi="Times New Roman"/>
           <w:sz w:val="20"/>
         </w:rPr>
-        <w:t>7. Zhou, B., Liu, J., Wang, Z. M. &amp; Xi, T. C-reactive protein, interleukin 6 and lung cancer risk: a meta-analysis. PLoS One 7, e43075, doi:10.1371/journal.pone.0043075 (2012).</w:t>
+        <w:t>7. Collins GS, Reitsma JB, Altman DG, Moons KGM. Transparent reporting of a multivariable prediction model for individual prognosis or diagnosis (TRIPOD): The TRIPOD statement. BMJ. 2015;350:g7594. doi:10.1136/bmj.g7594</w:t>
       </w:r>
     </w:p>
     <w:p>
@@ -1582,7 +1715,7 @@
           <w:rFonts w:ascii="Times New Roman" w:hAnsi="Times New Roman"/>
           <w:sz w:val="20"/>
         </w:rPr>
-        <w:t>8. Di Lorenzo, C., Dell'agli, M., Colombo, E., Sangiovanni, E. &amp; Restani, P. Metabolic syndrome and inflammation: a critical review of in vitro and clinical approaches for benefit assessment of plant food supplements. Evid Based Complement Alternat Med 2013, 782461, doi:10.1155/2013/782461 (2013).</w:t>
+        <w:t>8. Coussens LM, Werb Z. Inflammation and cancer. Nature. 2002;420(6917):860-867. doi:10.1038/nature01322</w:t>
       </w:r>
     </w:p>
     <w:p>
@@ -1596,7 +1729,7 @@
           <w:rFonts w:ascii="Times New Roman" w:hAnsi="Times New Roman"/>
           <w:sz w:val="20"/>
         </w:rPr>
-        <w:t>9. Sanderson, E. et al. Mendelian randomization. Nat Rev Methods Primers 2, doi:10.1038/s43586-021-00092-5 (2022).</w:t>
+        <w:t>9. Dor Y, Cedar H. Principles of DNA methylation and their implications for biology and medicine. Lancet. 2018;392(10149):777-786. doi:10.1016/S0140-6736(18)31268-6</w:t>
       </w:r>
     </w:p>
     <w:p>
@@ -1610,7 +1743,7 @@
           <w:rFonts w:ascii="Times New Roman" w:hAnsi="Times New Roman"/>
           <w:sz w:val="20"/>
         </w:rPr>
-        <w:t>10. Kaelin, W. G., Jr. &amp; McKnight, S. L. Influence of metabolism on epigenetics and disease. Cell 153, 56–69, doi:10.1016/j.cell.2013.03.004 (2013).</w:t>
+        <w:t>10. Fabregat A, Sidiropoulos K, Garapati P, et al. The reactome pathway knowledgebase. Nucleic Acids Res. 2016;44(D1):D481-D487. doi:10.1093/nar/gkv1351</w:t>
       </w:r>
     </w:p>
     <w:p>
@@ -1624,7 +1757,7 @@
           <w:rFonts w:ascii="Times New Roman" w:hAnsi="Times New Roman"/>
           <w:sz w:val="20"/>
         </w:rPr>
-        <w:t>11. Burgess, S. et al. Guidelines for performing Mendelian randomization investigations: update for summer 2023. Wellcome Open Res 4, 186, doi:10.12688/wellcomeopenres.15555.3 (2019).</w:t>
+        <w:t>11. Gaunt TR, Shihab HA, Hemani G, et al. Systematic identification of genetic influences on methylation across the human life course. Genome Biol. 2016;17(1):61. doi:10.1186/s13059-016-0926-z</w:t>
       </w:r>
     </w:p>
     <w:p>
@@ -1638,7 +1771,7 @@
           <w:rFonts w:ascii="Times New Roman" w:hAnsi="Times New Roman"/>
           <w:sz w:val="20"/>
         </w:rPr>
-        <w:t>12. Lu, C. &amp; Thompson, C. B. Metabolic regulation of epigenetics. Cell Metab 16, 9–17, doi:10.1016/j.cmet.2012.06.001 (2012).</w:t>
+        <w:t>12. Gay LJ, Felding-Habermann B. Contribution of platelets to tumour metastasis. Nat Rev Cancer. 2011;11(2):123-134. doi:10.1038/nrc3004</w:t>
       </w:r>
     </w:p>
     <w:p>
@@ -1652,7 +1785,7 @@
           <w:rFonts w:ascii="Times New Roman" w:hAnsi="Times New Roman"/>
           <w:sz w:val="20"/>
         </w:rPr>
-        <w:t>13. consortium, B. Quantitative comparison of DNA methylation assays for biomarker development and clinical applications. Nat Biotechnol 34, 726–737, doi:10.1038/nbt.3605 (2016).</w:t>
+        <w:t>13. Giambartolomei C, Vukcevic D, Schadt EE, et al. Bayesian test for colocalisation between pairs of genetic association studies using summary statistics. Williams SM, ed. PLoS Genet. 2014;10(5):e1004383. doi:10.1371/journal.pgen.1004383</w:t>
       </w:r>
     </w:p>
     <w:p>
@@ -1666,7 +1799,7 @@
           <w:rFonts w:ascii="Times New Roman" w:hAnsi="Times New Roman"/>
           <w:sz w:val="20"/>
         </w:rPr>
-        <w:t>14. Wagner, W. How to Translate DNA Methylation Biomarkers Into Clinical Practice. Front Cell Dev Biol 10, 854797, doi:10.3389/fcell.2022.854797 (2022).</w:t>
+        <w:t>14. Goldstraw P, Chansky K, Crowley J, et al. The IASLC lung cancer staging project: Proposals for revision of the TNM stage groupings in the forthcoming (eighth) edition of the TNM classification for lung cancer. Journal of Thoracic Oncology. 2016;11(1):39-51. doi:10.1016/j.jtho.2015.09.009</w:t>
       </w:r>
     </w:p>
     <w:p>
@@ -1680,7 +1813,7 @@
           <w:rFonts w:ascii="Times New Roman" w:hAnsi="Times New Roman"/>
           <w:sz w:val="20"/>
         </w:rPr>
-        <w:t>15. Gaunt, T. R. et al. Systematic identification of genetic influences on methylation across the human life course. Genome Biol 17, 61, doi:10.1186/s13059-016-0926-z (2016).</w:t>
+        <w:t>15. Greten FR, Grivennikov SI. Inflammation and cancer: Triggers, mechanisms, and consequences. Immunity. 2019;51(1):27-41. doi:10.1016/j.immuni.2019.06.025</w:t>
       </w:r>
     </w:p>
     <w:p>
@@ -1694,7 +1827,7 @@
           <w:rFonts w:ascii="Times New Roman" w:hAnsi="Times New Roman"/>
           <w:sz w:val="20"/>
         </w:rPr>
-        <w:t>16. Relton, C. L. &amp; Davey Smith, G. Two-step epigenetic Mendelian randomization: a strategy for establishing the causal role of epigenetic processes in pathways to disease. Int J Epidemiol 41, 161–176, doi:10.1093/ije/dyr233 (2012).</w:t>
+        <w:t>16. Hänzelmann S, Castelo R, Guinney J. GSVA: Gene set variation analysis for microarray and RNA-seq data. BMC Bioinformatics. 2013;14(1):7. doi:10.1186/1471-2105-14-7</w:t>
       </w:r>
     </w:p>
     <w:p>
@@ -1708,7 +1841,7 @@
           <w:rFonts w:ascii="Times New Roman" w:hAnsi="Times New Roman"/>
           <w:sz w:val="20"/>
         </w:rPr>
-        <w:t>17. Richardson, T. G. et al. Systematic Mendelian randomization framework elucidates hundreds of CpG sites which may mediate the influence of genetic variants on disease. Hum Mol Genet 27, 3293–3304, doi:10.1093/hmg/ddy210 (2018).</w:t>
+        <w:t>17. Hasin Y, Seldin M, Lusis A. Multi-omics approaches to disease. Genome Biol. 2017;18(1):83. doi:10.1186/s13059-017-1215-1</w:t>
       </w:r>
     </w:p>
     <w:p>
@@ -1722,7 +1855,7 @@
           <w:rFonts w:ascii="Times New Roman" w:hAnsi="Times New Roman"/>
           <w:sz w:val="20"/>
         </w:rPr>
-        <w:t>18. Locke, A. E. et al. Genetic studies of body mass index yield new insights for obesity biology. Nature 518, 197–206, doi:10.1038/nature14177 (2015).</w:t>
+        <w:t>18. Hemani G, Zheng J, Elsworth B, et al. The MR-base platform supports systematic causal inference across the human phenome. eLife. 2018;7:e34408. doi:10.7554/eLife.34408</w:t>
       </w:r>
     </w:p>
     <w:p>
@@ -1736,7 +1869,7 @@
           <w:rFonts w:ascii="Times New Roman" w:hAnsi="Times New Roman"/>
           <w:sz w:val="20"/>
         </w:rPr>
-        <w:t>19. Liu, M. et al. Association studies of up to 1.2 million individuals yield new insights into the genetic etiology of tobacco and alcohol use. Nat Genet 51, 237–244, doi:10.1038/s41588-018-0307-5 (2019).</w:t>
+        <w:t>19. Johnson WE, Li C, Rabinovic A. Adjusting batch effects in microarray expression data using empirical bayes methods. Biostatistics. 2007;8(1):118-127. doi:10.1093/biostatistics/kxj037</w:t>
       </w:r>
     </w:p>
     <w:p>
@@ -1750,7 +1883,7 @@
           <w:rFonts w:ascii="Times New Roman" w:hAnsi="Times New Roman"/>
           <w:sz w:val="20"/>
         </w:rPr>
-        <w:t>20. Ligthart, S. et al. Genome Analyses of &gt;200,000 Individuals Identify 58 Loci for Chronic Inflammation and Highlight Pathways that Link Inflammation and Complex Disorders. Am J Hum Genet 103, 691–706, doi:10.1016/j.ajhg.2018.09.009 (2018).</w:t>
+        <w:t>20. Kaelin WG, McKnight SL. Influence of metabolism on epigenetics and disease. Cell. 2013;153(1):56-69. doi:10.1016/j.cell.2013.03.004</w:t>
       </w:r>
     </w:p>
     <w:p>
@@ -1764,7 +1897,7 @@
           <w:rFonts w:ascii="Times New Roman" w:hAnsi="Times New Roman"/>
           <w:sz w:val="20"/>
         </w:rPr>
-        <w:t>21. Willer, C. J. et al. Discovery and refinement of loci associated with lipid levels. Nat Genet 45, 1274–1283, doi:10.1038/ng.2797 (2013).</w:t>
+        <w:t>21. Labelle M, Begum S, Hynes RO. Direct signaling between platelets and cancer cells induces an epithelial-mesenchymal-like transition and promotes metastasis. Cancer Cell. 2011;20(5):576-590. doi:10.1016/j.ccr.2011.09.009</w:t>
       </w:r>
     </w:p>
     <w:p>
@@ -1778,7 +1911,7 @@
           <w:rFonts w:ascii="Times New Roman" w:hAnsi="Times New Roman"/>
           <w:sz w:val="20"/>
         </w:rPr>
-        <w:t>22. McKay, J. D. et al. Large-scale association analysis identifies new lung cancer susceptibility loci and heterogeneity in genetic susceptibility across histological subtypes. Nat Genet 49, 1126–1132, doi:10.1038/ng.3892 (2017).</w:t>
+        <w:t>22. Laird PW. The power and the promise of DNA methylation markers. Nat Rev Cancer. 2003;3(4):253-266. doi:10.1038/nrc1045</w:t>
       </w:r>
     </w:p>
     <w:p>
@@ -1792,7 +1925,7 @@
           <w:rFonts w:ascii="Times New Roman" w:hAnsi="Times New Roman"/>
           <w:sz w:val="20"/>
         </w:rPr>
-        <w:t>23. Fanidi, A. et al. Circulating Folate, Vitamin B6, and Methionine in Relation to Lung Cancer Risk in the Lung Cancer Cohort Consortium (LC3). J Natl Cancer Inst 110, 57–67, doi:10.1093/jnci/djx119 (2018).</w:t>
+        <w:t>23. Lau SCM, Pan Y, Velcheti V, Wong KK. Squamous cell lung cancer: Current landscape and future therapeutic options. Cancer Cell. 2022;40(11):1279-1293. doi:10.1016/j.ccell.2022.09.018</w:t>
       </w:r>
     </w:p>
     <w:p>
@@ -1806,7 +1939,7 @@
           <w:rFonts w:ascii="Times New Roman" w:hAnsi="Times New Roman"/>
           <w:sz w:val="20"/>
         </w:rPr>
-        <w:t>24. Sung, H. et al. Global Cancer Statistics 2020: GLOBOCAN Estimates of Incidence and Mortality Worldwide for 36 Cancers in 185 Countries. CA Cancer J Clin 71, 209–249, doi:10.3322/caac.21660 (2021).</w:t>
+        <w:t>24. Love MI, Huber W, Anders S. Moderated estimation of fold change and dispersion for RNA-seq data with DESeq2. Genome Biol. 2014;15(12):550. doi:10.1186/s13059-014-0550-8</w:t>
       </w:r>
     </w:p>
     <w:p>
@@ -1820,7 +1953,7 @@
           <w:rFonts w:ascii="Times New Roman" w:hAnsi="Times New Roman"/>
           <w:sz w:val="20"/>
         </w:rPr>
-        <w:t>25. Davies, N. M., Holmes, M. V. &amp; Davey Smith, G. Reading Mendelian randomisation studies: a guide, glossary, and checklist for clinicians. BMJ 362, k601, doi:10.1136/bmj.k601 (2018).</w:t>
+        <w:t>25. Mantovani A, Allavena P, Sica A, Balkwill F. Cancer-related inflammation. Nature. 2008;454(7203):436-444. doi:10.1038/nature07205</w:t>
       </w:r>
     </w:p>
     <w:p>
@@ -1834,7 +1967,7 @@
           <w:rFonts w:ascii="Times New Roman" w:hAnsi="Times New Roman"/>
           <w:sz w:val="20"/>
         </w:rPr>
-        <w:t>26. Hemani, G. et al. The MR-Base platform supports systematic causal inference across the human phenome. Elife 7, doi:10.7554/eLife.34408 (2018).</w:t>
+        <w:t>26. Min JL, Hemani G, Hannon E, et al. Genomic and phenotypic insights from an atlas of genetic effects on DNA methylation. Nat Genet. 2021;53(9):1311-1321. doi:10.1038/s41588-021-00923-x</w:t>
       </w:r>
     </w:p>
     <w:p>
@@ -1848,7 +1981,7 @@
           <w:rFonts w:ascii="Times New Roman" w:hAnsi="Times New Roman"/>
           <w:sz w:val="20"/>
         </w:rPr>
-        <w:t>27. Verbanck, M., Chen, C. Y., Neale, B. &amp; Do, R. Publisher Correction: Detection of widespread horizontal pleiotropy in causal relationships inferred from Mendelian randomization between complex traits and diseases. Nat Genet 50, 1196, doi:10.1038/s41588-018-0164-2 (2018).</w:t>
+        <w:t>27. Potter AL, Costantino CL, Suliman RA, et al. Recurrence after complete resection for non-small cell lung cancer in the national lung screening trial. The Annals of Thoracic Surgery. 2023;116(4):684-692. doi:10.1016/j.athoracsur.2023.06.004</w:t>
       </w:r>
     </w:p>
     <w:p>
@@ -1862,7 +1995,7 @@
           <w:rFonts w:ascii="Times New Roman" w:hAnsi="Times New Roman"/>
           <w:sz w:val="20"/>
         </w:rPr>
-        <w:t>28. Consortium, G. T. The GTEx Consortium atlas of genetic regulatory effects across human tissues. Science 369, 1318–1330, doi:10.1126/science.aaz1776 (2020).</w:t>
+        <w:t>28. Rajaram R, Huang Q, Li RZ, et al. Recurrence-free survival in patients with surgically resected non-small cell lung cancer. CHEST. 2024;165(5):1260-1270. doi:10.1016/j.chest.2023.11.042</w:t>
       </w:r>
     </w:p>
     <w:p>
@@ -1876,7 +2009,7 @@
           <w:rFonts w:ascii="Times New Roman" w:hAnsi="Times New Roman"/>
           <w:sz w:val="20"/>
         </w:rPr>
-        <w:t>29. Giambartolomei, C. et al. Bayesian test for colocalisation between pairs of genetic association studies using summary statistics. PLoS Genet 10, e1004383, doi:10.1371/journal.pgen.1004383 (2014).</w:t>
+        <w:t>29. Relton CL, Davey Smith G. Two-step epigenetic mendelian randomization: A strategy for establishing the causal role of epigenetic processes in pathways to disease. Int J Epidemiol. 2012;41(1):161-176. doi:10.1093/ije/dyr233</w:t>
       </w:r>
     </w:p>
     <w:p>
@@ -1890,7 +2023,7 @@
           <w:rFonts w:ascii="Times New Roman" w:hAnsi="Times New Roman"/>
           <w:sz w:val="20"/>
         </w:rPr>
-        <w:t>30. Love, M. I., Huber, W. &amp; Anders, S. Moderated estimation of fold change and dispersion for RNA-seq data with DESeq2. Genome Biol 15, 550, doi:10.1186/s13059-014-0550-8 (2014).</w:t>
+        <w:t>30. Richardson TG, Haycock PC, Zheng J, et al. Systematic mendelian randomization framework elucidates hundreds of CpG sites which may mediate the influence of genetic variants on disease. Human Molecular Genetics. 2018;27(18):3293-3304. doi:10.1093/hmg/ddy210</w:t>
       </w:r>
     </w:p>
     <w:p>
@@ -1904,7 +2037,7 @@
           <w:rFonts w:ascii="Times New Roman" w:hAnsi="Times New Roman"/>
           <w:sz w:val="20"/>
         </w:rPr>
-        <w:t>31. Robinson, M. D., McCarthy, D. J. &amp; Smyth, G. K. edgeR: a Bioconductor package for differential expression analysis of digital gene expression data. Bioinformatics 26, 139–140, doi:10.1093/bioinformatics/btp616 (2010).</w:t>
+        <w:t>31. Robinson MD, McCarthy DJ, Smyth GK. edgeR : A bioconductor package for differential expression analysis of digital gene expression data. Bioinformatics. 2010;26(1):139-140. doi:10.1093/bioinformatics/btp616</w:t>
       </w:r>
     </w:p>
     <w:p>
@@ -1918,7 +2051,7 @@
           <w:rFonts w:ascii="Times New Roman" w:hAnsi="Times New Roman"/>
           <w:sz w:val="20"/>
         </w:rPr>
-        <w:t>32. Tanaka, T. [[Fundamentals] 5. Python+scikit-learn for Machine Learning in Medical Imaging]. Nihon Hoshasen Gijutsu Gakkai Zasshi 79, 1189–1193, doi:10.6009/jjrt.2023-2266 (2023).</w:t>
+        <w:t>32. Sanderson E, Davey Smith G, Windmeijer F, Bowden J. An examination of multivariable mendelian randomization in the single-sample and two-sample summary data settings. International Journal of Epidemiology. 2019;48(3):713-727. doi:10.1093/ije/dyy262</w:t>
       </w:r>
     </w:p>
     <w:p>
@@ -1932,7 +2065,7 @@
           <w:rFonts w:ascii="Times New Roman" w:hAnsi="Times New Roman"/>
           <w:sz w:val="20"/>
         </w:rPr>
-        <w:t>33. Troyanskaya, O. et al. Missing value estimation methods for DNA microarrays. Bioinformatics 17, 520–525, doi:10.1093/bioinformatics/17.6.520 (2001).</w:t>
+        <w:t>33. Siegel RL, Giaquinto AN, Jemal A. Cancer statistics, 2024. CA Cancer J Clin. 2024;74(1):12-49. doi:10.3322/caac.21820</w:t>
       </w:r>
     </w:p>
     <w:p>
@@ -1946,7 +2079,7 @@
           <w:rFonts w:ascii="Times New Roman" w:hAnsi="Times New Roman"/>
           <w:sz w:val="20"/>
         </w:rPr>
-        <w:t>34. Johnson, W. E., Li, C. &amp; Rabinovic, A. Adjusting batch effects in microarray expression data using empirical Bayes methods. Biostatistics 8, 118–127, doi:10.1093/biostatistics/kxj037 (2007).</w:t>
+        <w:t>34. Simon N, Friedman J, Hastie T, Tibshirani R. Regularization paths for cox’s proportional hazards model via coordinate descent. J Stat Softw. 2011;39(5):1-13. doi:10.18637/jss.v039.i05</w:t>
       </w:r>
     </w:p>
     <w:p>
@@ -1960,7 +2093,7 @@
           <w:rFonts w:ascii="Times New Roman" w:hAnsi="Times New Roman"/>
           <w:sz w:val="20"/>
         </w:rPr>
-        <w:t>35. Kanehisa, M. &amp; Goto, S. KEGG: kyoto encyclopedia of genes and genomes. Nucleic Acids Res 28, 27–30, doi:10.1093/nar/28.1.27 (2000).</w:t>
+        <w:t>35. Steyerberg EW. Clinical Prediction Models: A Practical Approach to Development, Validation, and Updating. Springer; 2019.</w:t>
       </w:r>
     </w:p>
     <w:p>
@@ -1974,7 +2107,7 @@
           <w:rFonts w:ascii="Times New Roman" w:hAnsi="Times New Roman"/>
           <w:sz w:val="20"/>
         </w:rPr>
-        <w:t>36. Yu, G., Wang, L. G., Han, Y. &amp; He, Q. Y. clusterProfiler: an R package for comparing biological themes among gene clusters. OMICS 16, 284–287, doi:10.1089/omi.2011.0118 (2012).</w:t>
+        <w:t>36. Sung H, Ferlay J, Siegel RL, et al. Global cancer statistics 2020: GLOBOCAN estimates of incidence and mortality worldwide for 36 cancers in 185 countries. CA A Cancer J Clinicians. 2021;71(3):209-249. doi:10.3322/caac.21660</w:t>
       </w:r>
     </w:p>
     <w:p>
@@ -1988,7 +2121,7 @@
           <w:rFonts w:ascii="Times New Roman" w:hAnsi="Times New Roman"/>
           <w:sz w:val="20"/>
         </w:rPr>
-        <w:t>37. Fabregat, A. et al. The Reactome pathway Knowledgebase. Nucleic Acids Res 44, D481–487, doi:10.1093/nar/gkv1351 (2016).</w:t>
+        <w:t>37. The Cancer Genome Atlas Research Network. Comprehensive genomic characterization of squamous cell lung cancers. Nature. 2012;489(7417):519-525. doi:10.1038/nature11404</w:t>
       </w:r>
     </w:p>
     <w:p>
@@ -2002,7 +2135,7 @@
           <w:rFonts w:ascii="Times New Roman" w:hAnsi="Times New Roman"/>
           <w:sz w:val="20"/>
         </w:rPr>
-        <w:t>38. Hanzelmann, S., Castelo, R. &amp; Guinney, J. GSVA: gene set variation analysis for microarray and RNA-seq data. BMC Bioinformatics 14, 7, doi:10.1186/1471-2105-14-7 (2013).</w:t>
+        <w:t>38. The GTEx Consortium, Aguet F, Anand S, et al. The GTEx consortium atlas of genetic regulatory effects across human tissues. Science. 2020;369(6509):1318-1330. doi:10.1126/science.aaz1776</w:t>
       </w:r>
     </w:p>
     <w:p>
@@ -2016,7 +2149,7 @@
           <w:rFonts w:ascii="Times New Roman" w:hAnsi="Times New Roman"/>
           <w:sz w:val="20"/>
         </w:rPr>
-        <w:t>39. Friedman, J., Hastie, T. &amp; Tibshirani, R. Regularization Paths for Generalized Linear Models via Coordinate Descent. J Stat Softw 33, 1–22 (2010).</w:t>
+        <w:t>39. The LifeLines Cohort Study, The ADIPOGen Consortium, The AGEN-BMI Working Group, et al. Genetic studies of body mass index yield new insights for obesity biology. Nature. 2015;518(7538):197-206. doi:10.1038/nature14177</w:t>
       </w:r>
     </w:p>
     <w:p>
@@ -2030,7 +2163,7 @@
           <w:rFonts w:ascii="Times New Roman" w:hAnsi="Times New Roman"/>
           <w:sz w:val="20"/>
         </w:rPr>
-        <w:t>40. Dinse, G. E. &amp; Lagakos, S. W. Nonparametric estimation of lifetime and disease onset distributions from incomplete observations. Biometrics 38, 921–932 (1982).</w:t>
+        <w:t>40. Uno H, Cai T, Pencina MJ, D’Agostino RB, Wei LJ. On the C-statistics for evaluating overall adequacy of risk prediction procedures with censored survival data. Stat Med. 2011;30(10):1105-1117. doi:10.1002/sim.4154</w:t>
       </w:r>
     </w:p>
     <w:p>
@@ -2044,7 +2177,7 @@
           <w:rFonts w:ascii="Times New Roman" w:hAnsi="Times New Roman"/>
           <w:sz w:val="20"/>
         </w:rPr>
-        <w:t>41. Goldstraw, P. et al. The IASLC Lung Cancer Staging Project: Proposals for Revision of the TNM Stage Groupings in the Forthcoming (Eighth) Edition of the TNM Classification for Lung Cancer. J Thorac Oncol 11, 39–51, doi:10.1016/j.jtho.2015.09.009 (2016).</w:t>
+        <w:t>41. Verbanck M, Chen CY, Neale B, Do R. Publisher correction: Detection of widespread horizontal pleiotropy in causal relationships inferred from mendelian randomization between complex traits and diseases. Nat Genet. 2018;50(8):1196-1196. doi:10.1038/s41588-018-0164-2</w:t>
       </w:r>
     </w:p>
     <w:p>
@@ -2058,7 +2191,7 @@
           <w:rFonts w:ascii="Times New Roman" w:hAnsi="Times New Roman"/>
           <w:sz w:val="20"/>
         </w:rPr>
-        <w:t>42. Satpathy, S. et al. A proteogenomic portrait of lung squamous cell carcinoma. Cell 184, 4348–4371 e4340, doi:10.1016/j.cell.2021.07.016 (2021).</w:t>
+        <w:t>42. Wagner W. How to translate DNA methylation biomarkers into clinical practice. Front Cell Dev Biol. 2022;10:854797. doi:10.3389/fcell.2022.854797</w:t>
       </w:r>
     </w:p>
     <w:p>
@@ -2072,7 +2205,7 @@
           <w:rFonts w:ascii="Times New Roman" w:hAnsi="Times New Roman"/>
           <w:sz w:val="20"/>
         </w:rPr>
-        <w:t>43. Bowden, J., Davey Smith, G. &amp; Burgess, S. Mendelian randomization with invalid instruments: effect estimation and bias detection through Egger regression. Int J Epidemiol 44, 512–525, doi:10.1093/ije/dyv080 (2015).</w:t>
+        <w:t>43. Wallace C. A more accurate method for colocalisation analysis allowing for multiple causal variants. Cordell HJ, ed. PLoS Genet. 2021;17(9):e1009440. doi:10.1371/journal.pgen.1009440</w:t>
       </w:r>
     </w:p>
     <w:p>
@@ -2086,7 +2219,7 @@
           <w:rFonts w:ascii="Times New Roman" w:hAnsi="Times New Roman"/>
           <w:sz w:val="20"/>
         </w:rPr>
-        <w:t>44. Smith, G. D. &amp; Ebrahim, S. 'Mendelian randomization': can genetic epidemiology contribute to understanding environmental determinants of disease? Int J Epidemiol 32, 1–22, doi:10.1093/ije/dyg070 (2003).</w:t>
+        <w:t>44. Wolff RF, Moons KGM, Riley RD, et al. PROBAST: A tool to assess the risk of bias and applicability of prediction model studies. Ann Intern Med. 2019;170(1):51-58. doi:10.7326/M18-1376</w:t>
       </w:r>
     </w:p>
     <w:p>
@@ -2100,105 +2233,7 @@
           <w:rFonts w:ascii="Times New Roman" w:hAnsi="Times New Roman"/>
           <w:sz w:val="20"/>
         </w:rPr>
-        <w:t>45. Wallace, C. A more accurate method for colocalisation analysis allowing for multiple causal variants. PLoS Genet 17, e1009440, doi:10.1371/journal.pgen.1009440 (2021).</w:t>
-      </w:r>
-    </w:p>
-    <w:p>
-      <w:pPr>
-        <w:spacing w:line="240" w:lineRule="auto" w:after="40"/>
-        <w:ind w:left="360" w:hanging="360"/>
-        <w:jc w:val="both"/>
-      </w:pPr>
-      <w:r>
-        <w:rPr>
-          <w:rFonts w:ascii="Times New Roman" w:hAnsi="Times New Roman"/>
-          <w:sz w:val="20"/>
-        </w:rPr>
-        <w:t>46. Min, J. L. et al. Genomic and phenotypic insights from an atlas of genetic effects on DNA methylation. Nat Genet 53, 1311–1321, doi:10.1038/s41588-021-00923-x (2021).</w:t>
-      </w:r>
-    </w:p>
-    <w:p>
-      <w:pPr>
-        <w:spacing w:line="240" w:lineRule="auto" w:after="40"/>
-        <w:ind w:left="360" w:hanging="360"/>
-        <w:jc w:val="both"/>
-      </w:pPr>
-      <w:r>
-        <w:rPr>
-          <w:rFonts w:ascii="Times New Roman" w:hAnsi="Times New Roman"/>
-          <w:sz w:val="20"/>
-        </w:rPr>
-        <w:t>47. Sanderson, E., Davey Smith, G., Windmeijer, F. &amp; Bowden, J. An examination of multivariable Mendelian randomization in the single-sample and two-sample summary data settings. Int J Epidemiol 48, 713–727, doi:10.1093/ije/dyy262 (2019).</w:t>
-      </w:r>
-    </w:p>
-    <w:p>
-      <w:pPr>
-        <w:spacing w:line="240" w:lineRule="auto" w:after="40"/>
-        <w:ind w:left="360" w:hanging="360"/>
-        <w:jc w:val="both"/>
-      </w:pPr>
-      <w:r>
-        <w:rPr>
-          <w:rFonts w:ascii="Times New Roman" w:hAnsi="Times New Roman"/>
-          <w:sz w:val="20"/>
-        </w:rPr>
-        <w:t>48. Mantovani, A., Allavena, P., Sica, A. &amp; Balkwill, F. Cancer-related inflammation. Nature 454, 436–444, doi:10.1038/nature07205 (2008).</w:t>
-      </w:r>
-    </w:p>
-    <w:p>
-      <w:pPr>
-        <w:spacing w:line="240" w:lineRule="auto" w:after="40"/>
-        <w:ind w:left="360" w:hanging="360"/>
-        <w:jc w:val="both"/>
-      </w:pPr>
-      <w:r>
-        <w:rPr>
-          <w:rFonts w:ascii="Times New Roman" w:hAnsi="Times New Roman"/>
-          <w:sz w:val="20"/>
-        </w:rPr>
-        <w:t>49. Coussens, L. M. &amp; Werb, Z. Inflammation and cancer. Nature 420, 860–867, doi:10.1038/nature01322 (2002).</w:t>
-      </w:r>
-    </w:p>
-    <w:p>
-      <w:pPr>
-        <w:spacing w:line="240" w:lineRule="auto" w:after="40"/>
-        <w:ind w:left="360" w:hanging="360"/>
-        <w:jc w:val="both"/>
-      </w:pPr>
-      <w:r>
-        <w:rPr>
-          <w:rFonts w:ascii="Times New Roman" w:hAnsi="Times New Roman"/>
-          <w:sz w:val="20"/>
-        </w:rPr>
-        <w:t>50. Carter, A. R. et al. Mendelian randomisation for mediation analysis: current methods and challenges for implementation. Eur J Epidemiol 36, 465–478, doi:10.1007/s10654-021-00757-1 (2021).</w:t>
-      </w:r>
-    </w:p>
-    <w:p>
-      <w:pPr>
-        <w:spacing w:line="240" w:lineRule="auto" w:after="40"/>
-        <w:ind w:left="360" w:hanging="360"/>
-        <w:jc w:val="both"/>
-      </w:pPr>
-      <w:r>
-        <w:rPr>
-          <w:rFonts w:ascii="Times New Roman" w:hAnsi="Times New Roman"/>
-          <w:sz w:val="20"/>
-        </w:rPr>
-        <w:t>51. Gay, L. J. &amp; Felding-Habermann, B. Contribution of platelets to tumour metastasis. Nat Rev Cancer 11, 123–134, doi:10.1038/nrc3004 (2011).</w:t>
-      </w:r>
-    </w:p>
-    <w:p>
-      <w:pPr>
-        <w:spacing w:line="240" w:lineRule="auto" w:after="40"/>
-        <w:ind w:left="360" w:hanging="360"/>
-        <w:jc w:val="both"/>
-      </w:pPr>
-      <w:r>
-        <w:rPr>
-          <w:rFonts w:ascii="Times New Roman" w:hAnsi="Times New Roman"/>
-          <w:sz w:val="20"/>
-        </w:rPr>
-        <w:t>52. Laird, P. W. The power and the promise of DNA methylation markers. Nat Rev Cancer 3, 253–266, doi:10.1038/nrc1045 (2003).</w:t>
+        <w:t>45. Yu G, Wang LG, Han Y, He QY. clusterProfiler: An R package for comparing biological themes among gene clusters. OMICS: A Journal of Integrative Biology. 2012;16(5):284-287. doi:10.1089/omi.2011.0118</w:t>
       </w:r>
     </w:p>
     <w:sectPr>

</xml_diff>